<commit_message>
docs: record verified publication and confirmed application contact
</commit_message>
<xml_diff>
--- a/application/Eldar_Smagulov_SerpApi_Junior_Fullstack_CV.docx
+++ b/application/Eldar_Smagulov_SerpApi_Junior_Fullstack_CV.docx
@@ -106,12 +106,12 @@
         <w:rPr>
           <w:b/>
         </w:rPr>
-        <w:t>SearchScope — Search Intelligence &amp; API Analytics Platform | Local implementation</w:t>
+        <w:t>SearchScope — Search Intelligence &amp; API Analytics Platform | Personal project</w:t>
       </w:r>
     </w:p>
     <w:p>
       <w:r>
-        <w:t>Publication target: https://github.com/rokerblym/searchscope</w:t>
+        <w:t>Repository: https://github.com/rokerblym/searchscope</w:t>
       </w:r>
     </w:p>
     <w:p>

</xml_diff>